<commit_message>
update cover page details and checklist in Word docx
</commit_message>
<xml_diff>
--- a/CQ_Checklist nop cuon sau bao ve.docx
+++ b/CQ_Checklist nop cuon sau bao ve.docx
@@ -1,8 +1,8 @@
 
 <file path=word/document.xml><?xml version="1.0" encoding="utf-8"?>
-<w:document xmlns:mc="http://schemas.openxmlformats.org/markup-compatibility/2006" xmlns:o="urn:schemas-microsoft-com:office:office" xmlns:r="http://schemas.openxmlformats.org/officeDocument/2006/relationships" xmlns:m="http://schemas.openxmlformats.org/officeDocument/2006/math" xmlns:v="urn:schemas-microsoft-com:vml" xmlns:wp="http://schemas.openxmlformats.org/drawingml/2006/wordprocessingDrawing" xmlns:w10="urn:schemas-microsoft-com:office:word" xmlns:w="http://schemas.openxmlformats.org/wordprocessingml/2006/main" xmlns:wne="http://schemas.microsoft.com/office/word/2006/wordml" xmlns:sl="http://schemas.openxmlformats.org/schemaLibrary/2006/main" xmlns:a="http://schemas.openxmlformats.org/drawingml/2006/main" xmlns:pic="http://schemas.openxmlformats.org/drawingml/2006/picture" xmlns:c="http://schemas.openxmlformats.org/drawingml/2006/chart" xmlns:lc="http://schemas.openxmlformats.org/drawingml/2006/lockedCanvas" xmlns:dgm="http://schemas.openxmlformats.org/drawingml/2006/diagram" xmlns:wps="http://schemas.microsoft.com/office/word/2010/wordprocessingShape" xmlns:wpg="http://schemas.microsoft.com/office/word/2010/wordprocessingGroup" xmlns:w14="http://schemas.microsoft.com/office/word/2010/wordml" xmlns:w15="http://schemas.microsoft.com/office/word/2012/wordml" xmlns:w16="http://schemas.microsoft.com/office/word/2018/wordml" xmlns:w16cex="http://schemas.microsoft.com/office/word/2018/wordml/cex" xmlns:w16cid="http://schemas.microsoft.com/office/word/2016/wordml/cid" xmlns="http://schemas.microsoft.com/office/tasks/2019/documenttasks" xmlns:cr="http://schemas.microsoft.com/office/comments/2020/reactions">
+<w:document xmlns:ns1="http://schemas.microsoft.com/office/word/2010/wordml" xmlns:ns2="urn:schemas-microsoft-com:vml" xmlns:ns3="urn:schemas-microsoft-com:office:office" xmlns:r="http://schemas.openxmlformats.org/officeDocument/2006/relationships" xmlns:w="http://schemas.openxmlformats.org/wordprocessingml/2006/main">
   <w:body>
-    <w:p>
+    <w:p ns1:paraId="00000001">
       <w:pPr>
         <w:keepNext w:val="0"/>
         <w:keepLines w:val="0"/>
@@ -22,29 +22,29 @@
       </w:pPr>
       <w:r>
         <w:pict>
-          <v:shapetype id="_x0000_t75" coordsize="21600,21600" filled="f" stroked="f" o:spt="75.0" o:preferrelative="t" path="m@4@5l@4@11@9@11@9@5xe">
-            <v:stroke joinstyle="miter"/>
-            <v:formulas>
-              <v:f eqn="if lineDrawn pixelLineWidth 0"/>
-              <v:f eqn="sum @0 1 0"/>
-              <v:f eqn="sum 0 0 @1"/>
-              <v:f eqn="prod @2 1 2"/>
-              <v:f eqn="prod @3 21600 pixelWidth"/>
-              <v:f eqn="prod @3 21600 pixelHeight"/>
-              <v:f eqn="sum @0 0 1"/>
-              <v:f eqn="prod @6 1 2"/>
-              <v:f eqn="prod @7 21600 pixelWidth"/>
-              <v:f eqn="sum @8 21600 0"/>
-              <v:f eqn="prod @7 21600 pixelHeight"/>
-              <v:f eqn="sum @10 21600 0"/>
-            </v:formulas>
-            <v:path o:connecttype="rect" o:extrusionok="f" gradientshapeok="t"/>
-            <o:lock v:ext="edit" aspectratio="t"/>
-          </v:shapetype>
+          <ns2:shapetype id="_x0000_t75" coordsize="21600,21600" filled="f" stroked="f" ns3:spt="75.0" ns3:preferrelative="t" path="m@4@5l@4@11@9@11@9@5xe">
+            <ns2:stroke joinstyle="miter"/>
+            <ns2:formulas>
+              <ns2:f eqn="if lineDrawn pixelLineWidth 0"/>
+              <ns2:f eqn="sum @0 1 0"/>
+              <ns2:f eqn="sum 0 0 @1"/>
+              <ns2:f eqn="prod @2 1 2"/>
+              <ns2:f eqn="prod @3 21600 pixelWidth"/>
+              <ns2:f eqn="prod @3 21600 pixelHeight"/>
+              <ns2:f eqn="sum @0 0 1"/>
+              <ns2:f eqn="prod @6 1 2"/>
+              <ns2:f eqn="prod @7 21600 pixelWidth"/>
+              <ns2:f eqn="sum @8 21600 0"/>
+              <ns2:f eqn="prod @7 21600 pixelHeight"/>
+              <ns2:f eqn="sum @10 21600 0"/>
+            </ns2:formulas>
+            <ns2:path ns3:connecttype="rect" ns3:extrusionok="f" gradientshapeok="t"/>
+            <ns3:lock ns2:ext="edit" aspectratio="t"/>
+          </ns2:shapetype>
         </w:pict>
       </w:r>
     </w:p>
-    <w:p>
+    <w:p ns1:paraId="00000002">
       <w:pPr>
         <w:spacing w:line="360" w:lineRule="auto"/>
         <w:jc w:val="center"/>
@@ -102,7 +102,7 @@
           <w:tcPr>
             <w:vAlign w:val="center"/>
           </w:tcPr>
-          <w:p>
+          <w:p ns1:paraId="00000003">
             <w:pPr>
               <w:numPr>
                 <w:ilvl w:val="0"/>
@@ -132,7 +132,7 @@
               </w:rPr>
             </w:r>
           </w:p>
-          <w:p>
+          <w:p ns1:paraId="00000004">
             <w:pPr>
               <w:spacing w:line="360" w:lineRule="auto"/>
               <w:ind w:left="66" w:firstLine="0"/>
@@ -206,7 +206,7 @@
           <w:tcPr>
             <w:vAlign w:val="center"/>
           </w:tcPr>
-          <w:p>
+          <w:p ns1:paraId="00000005">
             <w:pPr>
               <w:spacing w:line="360" w:lineRule="auto"/>
               <w:ind w:left="-96" w:firstLine="96"/>
@@ -240,7 +240,7 @@
           <w:tcPr>
             <w:vAlign w:val="center"/>
           </w:tcPr>
-          <w:p>
+          <w:p ns1:paraId="00000006">
             <w:pPr>
               <w:numPr>
                 <w:ilvl w:val="0"/>
@@ -276,7 +276,7 @@
           <w:tcPr>
             <w:vAlign w:val="center"/>
           </w:tcPr>
-          <w:p>
+          <w:p ns1:paraId="00000007">
             <w:pPr>
               <w:spacing w:line="360" w:lineRule="auto"/>
               <w:jc w:val="center"/>
@@ -309,7 +309,7 @@
           <w:tcPr>
             <w:vAlign w:val="center"/>
           </w:tcPr>
-          <w:p>
+          <w:p ns1:paraId="00000008">
             <w:pPr>
               <w:numPr>
                 <w:ilvl w:val="0"/>
@@ -331,7 +331,7 @@
           <w:tcPr>
             <w:vAlign w:val="center"/>
           </w:tcPr>
-          <w:p>
+          <w:p ns1:paraId="00000009">
             <w:pPr>
               <w:spacing w:line="360" w:lineRule="auto"/>
               <w:jc w:val="center"/>
@@ -363,7 +363,7 @@
           <w:tcPr>
             <w:vAlign w:val="center"/>
           </w:tcPr>
-          <w:p>
+          <w:p ns1:paraId="0000000A">
             <w:pPr>
               <w:numPr>
                 <w:ilvl w:val="0"/>
@@ -405,7 +405,7 @@
           <w:tcPr>
             <w:vAlign w:val="center"/>
           </w:tcPr>
-          <w:p>
+          <w:p ns1:paraId="0000000B">
             <w:pPr>
               <w:spacing w:line="360" w:lineRule="auto"/>
               <w:jc w:val="center"/>
@@ -437,7 +437,7 @@
           <w:tcPr>
             <w:vAlign w:val="center"/>
           </w:tcPr>
-          <w:p>
+          <w:p ns1:paraId="0000000C">
             <w:pPr>
               <w:numPr>
                 <w:ilvl w:val="0"/>
@@ -459,7 +459,7 @@
               <w:t xml:space="preserve">Trang nhận xét của GVHD </w:t>
             </w:r>
           </w:p>
-          <w:p>
+          <w:p ns1:paraId="0000000D">
             <w:pPr>
               <w:spacing w:before="0" w:line="360" w:lineRule="auto"/>
               <w:ind w:left="66" w:firstLine="0"/>
@@ -482,7 +482,7 @@
           <w:tcPr>
             <w:vAlign w:val="center"/>
           </w:tcPr>
-          <w:p>
+          <w:p ns1:paraId="0000000E">
             <w:pPr>
               <w:spacing w:line="360" w:lineRule="auto"/>
               <w:jc w:val="center"/>
@@ -514,7 +514,7 @@
           <w:tcPr>
             <w:vAlign w:val="center"/>
           </w:tcPr>
-          <w:p>
+          <w:p ns1:paraId="0000000F">
             <w:pPr>
               <w:numPr>
                 <w:ilvl w:val="0"/>
@@ -536,7 +536,7 @@
               <w:t xml:space="preserve">Trang nhận xét GVPB </w:t>
             </w:r>
           </w:p>
-          <w:p>
+          <w:p ns1:paraId="00000010">
             <w:pPr>
               <w:spacing w:before="0" w:line="360" w:lineRule="auto"/>
               <w:ind w:left="66" w:firstLine="0"/>
@@ -564,7 +564,7 @@
           <w:tcPr>
             <w:vAlign w:val="center"/>
           </w:tcPr>
-          <w:p>
+          <w:p ns1:paraId="00000011">
             <w:pPr>
               <w:spacing w:line="360" w:lineRule="auto"/>
               <w:jc w:val="center"/>
@@ -596,7 +596,7 @@
           <w:tcPr>
             <w:vAlign w:val="center"/>
           </w:tcPr>
-          <w:p>
+          <w:p ns1:paraId="00000012">
             <w:pPr>
               <w:numPr>
                 <w:ilvl w:val="0"/>
@@ -618,7 +618,7 @@
           <w:tcPr>
             <w:vAlign w:val="center"/>
           </w:tcPr>
-          <w:p>
+          <w:p ns1:paraId="00000013">
             <w:pPr>
               <w:spacing w:line="360" w:lineRule="auto"/>
               <w:jc w:val="center"/>
@@ -651,7 +651,7 @@
           <w:tcPr>
             <w:vAlign w:val="center"/>
           </w:tcPr>
-          <w:p>
+          <w:p ns1:paraId="00000014">
             <w:pPr>
               <w:numPr>
                 <w:ilvl w:val="0"/>
@@ -686,7 +686,7 @@
           <w:tcPr>
             <w:vAlign w:val="center"/>
           </w:tcPr>
-          <w:p>
+          <w:p ns1:paraId="00000015">
             <w:pPr>
               <w:spacing w:line="360" w:lineRule="auto"/>
               <w:jc w:val="center"/>
@@ -719,7 +719,7 @@
           <w:tcPr>
             <w:vAlign w:val="center"/>
           </w:tcPr>
-          <w:p>
+          <w:p ns1:paraId="00000016">
             <w:pPr>
               <w:numPr>
                 <w:ilvl w:val="0"/>
@@ -741,7 +741,7 @@
           <w:tcPr>
             <w:vAlign w:val="center"/>
           </w:tcPr>
-          <w:p>
+          <w:p ns1:paraId="00000017">
             <w:pPr>
               <w:spacing w:line="360" w:lineRule="auto"/>
               <w:jc w:val="center"/>
@@ -774,7 +774,7 @@
           <w:tcPr>
             <w:vAlign w:val="center"/>
           </w:tcPr>
-          <w:p>
+          <w:p ns1:paraId="00000018">
             <w:pPr>
               <w:numPr>
                 <w:ilvl w:val="0"/>
@@ -796,7 +796,7 @@
           <w:tcPr>
             <w:vAlign w:val="center"/>
           </w:tcPr>
-          <w:p>
+          <w:p ns1:paraId="00000019">
             <w:pPr>
               <w:spacing w:line="360" w:lineRule="auto"/>
               <w:jc w:val="center"/>
@@ -829,7 +829,7 @@
           <w:tcPr>
             <w:vAlign w:val="center"/>
           </w:tcPr>
-          <w:p>
+          <w:p ns1:paraId="0000001A">
             <w:pPr>
               <w:numPr>
                 <w:ilvl w:val="0"/>
@@ -851,7 +851,7 @@
           <w:tcPr>
             <w:vAlign w:val="center"/>
           </w:tcPr>
-          <w:p>
+          <w:p ns1:paraId="0000001B">
             <w:pPr>
               <w:spacing w:line="360" w:lineRule="auto"/>
               <w:jc w:val="center"/>
@@ -884,7 +884,7 @@
           <w:tcPr>
             <w:vAlign w:val="center"/>
           </w:tcPr>
-          <w:p>
+          <w:p ns1:paraId="0000001C">
             <w:pPr>
               <w:numPr>
                 <w:ilvl w:val="0"/>
@@ -906,7 +906,7 @@
           <w:tcPr>
             <w:vAlign w:val="center"/>
           </w:tcPr>
-          <w:p>
+          <w:p ns1:paraId="0000001D">
             <w:pPr>
               <w:spacing w:line="360" w:lineRule="auto"/>
               <w:jc w:val="center"/>
@@ -930,7 +930,7 @@
         </w:tc>
       </w:tr>
     </w:tbl>
-    <w:p>
+    <w:p ns1:paraId="0000001E">
       <w:pPr>
         <w:spacing w:after="120" w:before="120" w:line="360" w:lineRule="auto"/>
         <w:jc w:val="both"/>
@@ -950,7 +950,7 @@
         <w:t xml:space="preserve">Kết quả bảo vệ của Sinh viên chỉ  được công nhận khi sinh viên thực hiện đầy đủ các yêu cầu và nộp đúng hạn quy định. </w:t>
       </w:r>
     </w:p>
-    <w:p>
+    <w:p ns1:paraId="0000001F">
       <w:pPr>
         <w:rPr/>
         <w:sectPr>
@@ -966,7 +966,7 @@
         </w:rPr>
       </w:r>
     </w:p>
-    <w:p>
+    <w:p ns1:paraId="00000020">
       <w:pPr>
         <w:pBdr>
           <w:top w:color="000000" w:space="1" w:sz="4" w:val="single"/>
@@ -984,9 +984,10 @@
         <w:rPr>
           <w:rtl w:val="0"/>
         </w:rPr>
-      </w:r>
-    </w:p>
-    <w:p>
+        <w:t>ĐẠI HỌC QUỐC GIA THÀNH PHỐ HỒ CHÍ MINH</w:t>
+      </w:r>
+    </w:p>
+    <w:p ns1:paraId="00000021">
       <w:pPr>
         <w:pBdr>
           <w:top w:color="000000" w:space="1" w:sz="4" w:val="single"/>
@@ -1009,7 +1010,7 @@
         <w:t xml:space="preserve">TRƯỜNG ĐẠI HỌC KHOA HỌC TỰ NHIÊN</w:t>
       </w:r>
     </w:p>
-    <w:p>
+    <w:p ns1:paraId="00000022">
       <w:pPr>
         <w:pBdr>
           <w:top w:color="000000" w:space="1" w:sz="4" w:val="single"/>
@@ -1032,7 +1033,7 @@
         <w:t xml:space="preserve">KHOA CÔNG NGHỆ THÔNG TIN</w:t>
       </w:r>
     </w:p>
-    <w:p>
+    <w:p ns1:paraId="00000023">
       <w:pPr>
         <w:pBdr>
           <w:top w:color="000000" w:space="1" w:sz="4" w:val="single"/>
@@ -1051,7 +1052,7 @@
         </w:rPr>
       </w:r>
     </w:p>
-    <w:p>
+    <w:p ns1:paraId="00000024">
       <w:pPr>
         <w:pBdr>
           <w:top w:color="000000" w:space="1" w:sz="4" w:val="single"/>
@@ -1068,9 +1069,10 @@
         <w:rPr>
           <w:rtl w:val="0"/>
         </w:rPr>
-      </w:r>
-    </w:p>
-    <w:p>
+        <w:t>Trần Xuân Minh Hiển 22120102</w:t>
+      </w:r>
+    </w:p>
+    <w:p ns1:paraId="00000025">
       <w:pPr>
         <w:pBdr>
           <w:top w:color="000000" w:space="1" w:sz="4" w:val="single"/>
@@ -1087,9 +1089,10 @@
         <w:rPr>
           <w:rtl w:val="0"/>
         </w:rPr>
-      </w:r>
-    </w:p>
-    <w:p>
+        <w:t>Nguyễn Hữu Khánh Nhân 22120247</w:t>
+      </w:r>
+    </w:p>
+    <w:p ns1:paraId="00000026">
       <w:pPr>
         <w:pBdr>
           <w:top w:color="000000" w:space="1" w:sz="4" w:val="single"/>
@@ -1109,12 +1112,12 @@
           <w:bCs w:val="1"/>
           <w:rtl w:val="0"/>
         </w:rPr>
-        <w:t xml:space="preserve">NGUYỄN VĂN A</w:t>
+        <w:t xml:space="preserve">Trần Anh Khoa 22120164</w:t>
         <w:tab/>
-        <w:t xml:space="preserve">– TRẦN THỊ B</w:t>
-      </w:r>
-    </w:p>
-    <w:p>
+        <w:t xml:space="preserve"/>
+      </w:r>
+    </w:p>
+    <w:p ns1:paraId="00000027">
       <w:pPr>
         <w:pBdr>
           <w:top w:color="000000" w:space="1" w:sz="4" w:val="single"/>
@@ -1131,9 +1134,10 @@
         <w:rPr>
           <w:rtl w:val="0"/>
         </w:rPr>
-      </w:r>
-    </w:p>
-    <w:p>
+        <w:t>Quách Thành Kiệt 22120175</w:t>
+      </w:r>
+    </w:p>
+    <w:p ns1:paraId="00000028">
       <w:pPr>
         <w:pBdr>
           <w:top w:color="000000" w:space="1" w:sz="4" w:val="single"/>
@@ -1150,9 +1154,10 @@
         <w:rPr>
           <w:rtl w:val="0"/>
         </w:rPr>
-      </w:r>
-    </w:p>
-    <w:p>
+        <w:t/>
+      </w:r>
+    </w:p>
+    <w:p ns1:paraId="00000029">
       <w:pPr>
         <w:pBdr>
           <w:top w:color="000000" w:space="1" w:sz="4" w:val="single"/>
@@ -1176,10 +1181,10 @@
           <w:szCs w:val="32"/>
           <w:rtl w:val="0"/>
         </w:rPr>
-        <w:t xml:space="preserve">TÊN ĐỀ TÀI</w:t>
-      </w:r>
-    </w:p>
-    <w:p>
+        <w:t xml:space="preserve">XÂY DỰNG HỆ THỐNG</w:t>
+      </w:r>
+    </w:p>
+    <w:p ns1:paraId="0000002A">
       <w:pPr>
         <w:pBdr>
           <w:top w:color="000000" w:space="1" w:sz="4" w:val="single"/>
@@ -1197,9 +1202,10 @@
         <w:rPr>
           <w:rtl w:val="0"/>
         </w:rPr>
-      </w:r>
-    </w:p>
-    <w:p>
+        <w:t>THEO DÕI BỆNH NHÂN TỪ XA</w:t>
+      </w:r>
+    </w:p>
+    <w:p ns1:paraId="0000002B">
       <w:pPr>
         <w:pBdr>
           <w:top w:color="000000" w:space="1" w:sz="4" w:val="single"/>
@@ -1220,10 +1226,10 @@
           <w:bCs w:val="1"/>
           <w:rtl w:val="0"/>
         </w:rPr>
-        <w:t xml:space="preserve">[LOẠI ĐỀ TÀI] CỬ NHÂN CNTT</w:t>
-      </w:r>
-    </w:p>
-    <w:p>
+        <w:t xml:space="preserve">CHO NGƯỜI BỆNH TĂNG HUYẾT ÁP</w:t>
+      </w:r>
+    </w:p>
+    <w:p ns1:paraId="0000002C">
       <w:pPr>
         <w:pBdr>
           <w:top w:color="000000" w:space="1" w:sz="4" w:val="single"/>
@@ -1244,10 +1250,10 @@
           <w:bCs w:val="1"/>
           <w:rtl w:val="0"/>
         </w:rPr>
-        <w:t xml:space="preserve">CHƯƠNG TRÌNH CHÍNH QUY CHUẨN</w:t>
-      </w:r>
-    </w:p>
-    <w:p>
+        <w:t xml:space="preserve">VÀ ĐÁI THÁO ĐƯỜNG</w:t>
+      </w:r>
+    </w:p>
+    <w:p ns1:paraId="0000002D">
       <w:pPr>
         <w:pBdr>
           <w:top w:color="000000" w:space="1" w:sz="4" w:val="single"/>
@@ -1264,9 +1270,10 @@
         <w:rPr>
           <w:rtl w:val="0"/>
         </w:rPr>
-      </w:r>
-    </w:p>
-    <w:p>
+        <w:t>THỰC TẬP DỰ ÁN TỐT NGHIỆP CỬ NHÂN</w:t>
+      </w:r>
+    </w:p>
+    <w:p ns1:paraId="0000002E">
       <w:pPr>
         <w:pBdr>
           <w:top w:color="000000" w:space="1" w:sz="4" w:val="single"/>
@@ -1283,9 +1290,10 @@
         <w:rPr>
           <w:rtl w:val="0"/>
         </w:rPr>
-      </w:r>
-    </w:p>
-    <w:p>
+        <w:t>CHƯƠNG TRÌNH CHÍNH QUY</w:t>
+      </w:r>
+    </w:p>
+    <w:p ns1:paraId="0000002F">
       <w:pPr>
         <w:pBdr>
           <w:top w:color="000000" w:space="1" w:sz="4" w:val="single"/>
@@ -1304,7 +1312,7 @@
         </w:rPr>
       </w:r>
     </w:p>
-    <w:p>
+    <w:p ns1:paraId="00000030">
       <w:pPr>
         <w:pBdr>
           <w:top w:color="000000" w:space="1" w:sz="4" w:val="single"/>
@@ -1323,7 +1331,7 @@
         </w:rPr>
       </w:r>
     </w:p>
-    <w:p>
+    <w:p ns1:paraId="00000031">
       <w:pPr>
         <w:pBdr>
           <w:top w:color="000000" w:space="1" w:sz="4" w:val="single"/>
@@ -1342,7 +1350,7 @@
         </w:rPr>
       </w:r>
     </w:p>
-    <w:p>
+    <w:p ns1:paraId="00000032">
       <w:pPr>
         <w:pBdr>
           <w:top w:color="000000" w:space="1" w:sz="4" w:val="single"/>
@@ -1361,7 +1369,7 @@
         </w:rPr>
       </w:r>
     </w:p>
-    <w:p>
+    <w:p ns1:paraId="00000033">
       <w:pPr>
         <w:pBdr>
           <w:top w:color="000000" w:space="1" w:sz="4" w:val="single"/>
@@ -1380,7 +1388,7 @@
         </w:rPr>
       </w:r>
     </w:p>
-    <w:p>
+    <w:p ns1:paraId="00000034">
       <w:pPr>
         <w:pBdr>
           <w:top w:color="000000" w:space="1" w:sz="4" w:val="single"/>
@@ -1399,7 +1407,7 @@
         </w:rPr>
       </w:r>
     </w:p>
-    <w:p>
+    <w:p ns1:paraId="00000035">
       <w:pPr>
         <w:pBdr>
           <w:top w:color="000000" w:space="1" w:sz="4" w:val="single"/>
@@ -1418,7 +1426,7 @@
         </w:rPr>
       </w:r>
     </w:p>
-    <w:p>
+    <w:p ns1:paraId="00000036">
       <w:pPr>
         <w:pBdr>
           <w:top w:color="000000" w:space="1" w:sz="4" w:val="single"/>
@@ -1437,7 +1445,7 @@
         </w:rPr>
       </w:r>
     </w:p>
-    <w:p>
+    <w:p ns1:paraId="00000037">
       <w:pPr>
         <w:pBdr>
           <w:top w:color="000000" w:space="1" w:sz="4" w:val="single"/>
@@ -1456,7 +1464,7 @@
         </w:rPr>
       </w:r>
     </w:p>
-    <w:p>
+    <w:p ns1:paraId="00000038">
       <w:pPr>
         <w:pBdr>
           <w:top w:color="000000" w:space="1" w:sz="4" w:val="single"/>
@@ -1475,7 +1483,7 @@
         </w:rPr>
       </w:r>
     </w:p>
-    <w:p>
+    <w:p ns1:paraId="00000039">
       <w:pPr>
         <w:pBdr>
           <w:top w:color="000000" w:space="1" w:sz="4" w:val="single"/>
@@ -1494,7 +1502,7 @@
         </w:rPr>
       </w:r>
     </w:p>
-    <w:p>
+    <w:p ns1:paraId="0000003A">
       <w:pPr>
         <w:pBdr>
           <w:top w:color="000000" w:space="1" w:sz="4" w:val="single"/>
@@ -1513,7 +1521,7 @@
         </w:rPr>
       </w:r>
     </w:p>
-    <w:p>
+    <w:p ns1:paraId="0000003B">
       <w:pPr>
         <w:pBdr>
           <w:top w:color="000000" w:space="1" w:sz="4" w:val="single"/>
@@ -1532,7 +1540,7 @@
         </w:rPr>
       </w:r>
     </w:p>
-    <w:p>
+    <w:p ns1:paraId="0000003C">
       <w:pPr>
         <w:pBdr>
           <w:top w:color="000000" w:space="1" w:sz="4" w:val="single"/>
@@ -1552,10 +1560,10 @@
           <w:bCs w:val="1"/>
           <w:rtl w:val="0"/>
         </w:rPr>
-        <w:t xml:space="preserve">Tp. Hồ Chí Minh, tháng MM/YYYY</w:t>
-      </w:r>
-    </w:p>
-    <w:p>
+        <w:t xml:space="preserve">Tp. Hồ Chí Minh, tháng 06/2026</w:t>
+      </w:r>
+    </w:p>
+    <w:p ns1:paraId="0000003D">
       <w:pPr>
         <w:pBdr>
           <w:top w:color="000000" w:space="1" w:sz="4" w:val="single"/>
@@ -1580,7 +1588,7 @@
         </w:rPr>
       </w:r>
     </w:p>
-    <w:p>
+    <w:p ns1:paraId="0000003E">
       <w:pPr>
         <w:rPr/>
       </w:pPr>
@@ -1590,7 +1598,7 @@
         </w:rPr>
       </w:r>
     </w:p>
-    <w:p>
+    <w:p ns1:paraId="0000003F">
       <w:pPr>
         <w:pBdr>
           <w:top w:color="000000" w:space="1" w:sz="4" w:val="single"/>
@@ -1605,9 +1613,10 @@
         <w:rPr>
           <w:rtl w:val="0"/>
         </w:rPr>
-      </w:r>
-    </w:p>
-    <w:p>
+        <w:t>ĐẠI HỌC QUỐC GIA THÀNH PHỐ HỒ CHÍ MINH</w:t>
+      </w:r>
+    </w:p>
+    <w:p ns1:paraId="00000040">
       <w:pPr>
         <w:pBdr>
           <w:top w:color="000000" w:space="1" w:sz="4" w:val="single"/>
@@ -1625,7 +1634,7 @@
         <w:t xml:space="preserve">TRƯỜNG ĐẠI HỌC KHOA HỌC TỰ NHIÊN</w:t>
       </w:r>
     </w:p>
-    <w:p>
+    <w:p ns1:paraId="00000041">
       <w:pPr>
         <w:pBdr>
           <w:top w:color="000000" w:space="1" w:sz="4" w:val="single"/>
@@ -1648,7 +1657,7 @@
         <w:t xml:space="preserve">KHOA CÔNG NGHỆ THÔNG TIN</w:t>
       </w:r>
     </w:p>
-    <w:p>
+    <w:p ns1:paraId="00000042">
       <w:pPr>
         <w:pBdr>
           <w:top w:color="000000" w:space="1" w:sz="4" w:val="single"/>
@@ -1664,7 +1673,7 @@
         </w:rPr>
       </w:r>
     </w:p>
-    <w:p>
+    <w:p ns1:paraId="00000043">
       <w:pPr>
         <w:pBdr>
           <w:top w:color="000000" w:space="1" w:sz="4" w:val="single"/>
@@ -1680,7 +1689,7 @@
         </w:rPr>
       </w:r>
     </w:p>
-    <w:p>
+    <w:p ns1:paraId="00000044">
       <w:pPr>
         <w:pBdr>
           <w:top w:color="000000" w:space="1" w:sz="4" w:val="single"/>
@@ -1694,9 +1703,10 @@
         <w:rPr>
           <w:rtl w:val="0"/>
         </w:rPr>
-      </w:r>
-    </w:p>
-    <w:p>
+        <w:t>Trần Xuân Minh Hiển 22120102</w:t>
+      </w:r>
+    </w:p>
+    <w:p ns1:paraId="00000045">
       <w:pPr>
         <w:pBdr>
           <w:top w:color="000000" w:space="1" w:sz="4" w:val="single"/>
@@ -1716,12 +1726,12 @@
           <w:bCs w:val="1"/>
           <w:rtl w:val="0"/>
         </w:rPr>
-        <w:t xml:space="preserve">NGUYỄN VĂN A</w:t>
+        <w:t xml:space="preserve">Nguyễn Hữu Khánh Nhân 22120247</w:t>
         <w:tab/>
-        <w:t xml:space="preserve">– 1512090</w:t>
-      </w:r>
-    </w:p>
-    <w:p>
+        <w:t xml:space="preserve"/>
+      </w:r>
+    </w:p>
+    <w:p ns1:paraId="00000046">
       <w:pPr>
         <w:pBdr>
           <w:top w:color="000000" w:space="1" w:sz="4" w:val="single"/>
@@ -1741,12 +1751,12 @@
           <w:bCs w:val="1"/>
           <w:rtl w:val="0"/>
         </w:rPr>
-        <w:t xml:space="preserve">TRẦN THỊ B</w:t>
+        <w:t xml:space="preserve">Trần Anh Khoa 22120164</w:t>
         <w:tab/>
-        <w:t xml:space="preserve">– 1512007</w:t>
-      </w:r>
-    </w:p>
-    <w:p>
+        <w:t xml:space="preserve"/>
+      </w:r>
+    </w:p>
+    <w:p ns1:paraId="00000047">
       <w:pPr>
         <w:pBdr>
           <w:top w:color="000000" w:space="1" w:sz="4" w:val="single"/>
@@ -1760,9 +1770,10 @@
         <w:rPr>
           <w:rtl w:val="0"/>
         </w:rPr>
-      </w:r>
-    </w:p>
-    <w:p>
+        <w:t>Quách Thành Kiệt 22120175</w:t>
+      </w:r>
+    </w:p>
+    <w:p ns1:paraId="00000048">
       <w:pPr>
         <w:pBdr>
           <w:top w:color="000000" w:space="1" w:sz="4" w:val="single"/>
@@ -1776,9 +1787,10 @@
         <w:rPr>
           <w:rtl w:val="0"/>
         </w:rPr>
-      </w:r>
-    </w:p>
-    <w:p>
+        <w:t/>
+      </w:r>
+    </w:p>
+    <w:p ns1:paraId="00000049">
       <w:pPr>
         <w:pBdr>
           <w:top w:color="000000" w:space="1" w:sz="4" w:val="single"/>
@@ -1802,10 +1814,10 @@
           <w:szCs w:val="32"/>
           <w:rtl w:val="0"/>
         </w:rPr>
-        <w:t xml:space="preserve">TÊN ĐỀ TÀI</w:t>
-      </w:r>
-    </w:p>
-    <w:p>
+        <w:t xml:space="preserve">XÂY DỰNG HỆ THỐNG</w:t>
+      </w:r>
+    </w:p>
+    <w:p ns1:paraId="0000004A">
       <w:pPr>
         <w:pBdr>
           <w:top w:color="000000" w:space="1" w:sz="4" w:val="single"/>
@@ -1823,9 +1835,10 @@
         <w:rPr>
           <w:rtl w:val="0"/>
         </w:rPr>
-      </w:r>
-    </w:p>
-    <w:p>
+        <w:t>THEO DÕI BỆNH NHÂN TỪ XA</w:t>
+      </w:r>
+    </w:p>
+    <w:p ns1:paraId="0000004B">
       <w:pPr>
         <w:pBdr>
           <w:top w:color="000000" w:space="1" w:sz="4" w:val="single"/>
@@ -1846,10 +1859,10 @@
           <w:bCs w:val="1"/>
           <w:rtl w:val="0"/>
         </w:rPr>
-        <w:t xml:space="preserve">[LOẠI ĐỀ TÀI] CỬ NHÂN CNTT</w:t>
-      </w:r>
-    </w:p>
-    <w:p>
+        <w:t xml:space="preserve">CHO NGƯỜI BỆNH TĂNG HUYẾT ÁP</w:t>
+      </w:r>
+    </w:p>
+    <w:p ns1:paraId="0000004C">
       <w:pPr>
         <w:pBdr>
           <w:top w:color="000000" w:space="1" w:sz="4" w:val="single"/>
@@ -1867,15 +1880,15 @@
           <w:bCs w:val="1"/>
           <w:rtl w:val="0"/>
         </w:rPr>
-        <w:t xml:space="preserve">CHƯƠNG TRÌNH CHÍNH QUY CHUẨN</w:t>
-      </w:r>
-      <w:r>
-        <w:rPr>
-          <w:rtl w:val="0"/>
-        </w:rPr>
-      </w:r>
-    </w:p>
-    <w:p>
+        <w:t xml:space="preserve">VÀ ĐÁI THÁO ĐƯỜNG</w:t>
+      </w:r>
+      <w:r>
+        <w:rPr>
+          <w:rtl w:val="0"/>
+        </w:rPr>
+      </w:r>
+    </w:p>
+    <w:p ns1:paraId="0000004D">
       <w:pPr>
         <w:pBdr>
           <w:top w:color="000000" w:space="1" w:sz="4" w:val="single"/>
@@ -1889,9 +1902,10 @@
         <w:rPr>
           <w:rtl w:val="0"/>
         </w:rPr>
-      </w:r>
-    </w:p>
-    <w:p>
+        <w:t>THỰC TẬP DỰ ÁN TỐT NGHIỆP CỬ NHÂN</w:t>
+      </w:r>
+    </w:p>
+    <w:p ns1:paraId="0000004E">
       <w:pPr>
         <w:pBdr>
           <w:top w:color="000000" w:space="1" w:sz="4" w:val="single"/>
@@ -1905,9 +1919,10 @@
         <w:rPr>
           <w:rtl w:val="0"/>
         </w:rPr>
-      </w:r>
-    </w:p>
-    <w:p>
+        <w:t>CHƯƠNG TRÌNH CHÍNH QUY</w:t>
+      </w:r>
+    </w:p>
+    <w:p ns1:paraId="0000004F">
       <w:pPr>
         <w:pBdr>
           <w:top w:color="000000" w:space="1" w:sz="4" w:val="single"/>
@@ -1923,7 +1938,7 @@
         </w:rPr>
       </w:r>
     </w:p>
-    <w:p>
+    <w:p ns1:paraId="00000050">
       <w:pPr>
         <w:pBdr>
           <w:top w:color="000000" w:space="1" w:sz="4" w:val="single"/>
@@ -1943,10 +1958,10 @@
           <w:bCs w:val="1"/>
           <w:rtl w:val="0"/>
         </w:rPr>
-        <w:t xml:space="preserve">GIẢNG VIÊN HƯỚNG DẪN</w:t>
-      </w:r>
-    </w:p>
-    <w:p>
+        <w:t xml:space="preserve">GIÁO VIÊN HƯỚNG DẪN</w:t>
+      </w:r>
+    </w:p>
+    <w:p ns1:paraId="00000051">
       <w:pPr>
         <w:pBdr>
           <w:top w:color="000000" w:space="1" w:sz="4" w:val="single"/>
@@ -1961,12 +1976,12 @@
         <w:rPr>
           <w:rtl w:val="0"/>
         </w:rPr>
-        <w:t xml:space="preserve">PGS.TS. </w:t>
+        <w:t xml:space="preserve">ThS. Đỗ Hoàng Cường</w:t>
         <w:tab/>
-        <w:t xml:space="preserve">Hoàng Văn C</w:t>
-      </w:r>
-    </w:p>
-    <w:p>
+        <w:t xml:space="preserve"/>
+      </w:r>
+    </w:p>
+    <w:p ns1:paraId="00000052">
       <w:pPr>
         <w:pBdr>
           <w:top w:color="000000" w:space="1" w:sz="4" w:val="single"/>
@@ -1981,12 +1996,12 @@
         <w:rPr>
           <w:rtl w:val="0"/>
         </w:rPr>
-        <w:t xml:space="preserve">TS. </w:t>
+        <w:t xml:space="preserve">ThS. Huỳnh Thụy Bảo Trân</w:t>
         <w:tab/>
-        <w:t xml:space="preserve">Lê Thị D</w:t>
-      </w:r>
-    </w:p>
-    <w:p>
+        <w:t xml:space="preserve"/>
+      </w:r>
+    </w:p>
+    <w:p ns1:paraId="00000053">
       <w:pPr>
         <w:pBdr>
           <w:top w:color="000000" w:space="1" w:sz="4" w:val="single"/>
@@ -2002,7 +2017,7 @@
         </w:rPr>
       </w:r>
     </w:p>
-    <w:p>
+    <w:p ns1:paraId="00000054">
       <w:pPr>
         <w:pBdr>
           <w:top w:color="000000" w:space="1" w:sz="4" w:val="single"/>
@@ -2018,7 +2033,7 @@
         </w:rPr>
       </w:r>
     </w:p>
-    <w:p>
+    <w:p ns1:paraId="00000055">
       <w:pPr>
         <w:pBdr>
           <w:top w:color="000000" w:space="1" w:sz="4" w:val="single"/>
@@ -2034,7 +2049,7 @@
         </w:rPr>
       </w:r>
     </w:p>
-    <w:p>
+    <w:p ns1:paraId="00000056">
       <w:pPr>
         <w:pBdr>
           <w:top w:color="000000" w:space="1" w:sz="4" w:val="single"/>
@@ -2050,7 +2065,7 @@
         </w:rPr>
       </w:r>
     </w:p>
-    <w:p>
+    <w:p ns1:paraId="00000057">
       <w:pPr>
         <w:pBdr>
           <w:top w:color="000000" w:space="1" w:sz="4" w:val="single"/>
@@ -2066,7 +2081,7 @@
         </w:rPr>
       </w:r>
     </w:p>
-    <w:p>
+    <w:p ns1:paraId="00000058">
       <w:pPr>
         <w:pBdr>
           <w:top w:color="000000" w:space="1" w:sz="4" w:val="single"/>
@@ -2082,7 +2097,7 @@
         </w:rPr>
       </w:r>
     </w:p>
-    <w:p>
+    <w:p ns1:paraId="00000059">
       <w:pPr>
         <w:pBdr>
           <w:top w:color="000000" w:space="1" w:sz="4" w:val="single"/>
@@ -2098,7 +2113,7 @@
         </w:rPr>
       </w:r>
     </w:p>
-    <w:p>
+    <w:p ns1:paraId="0000005A">
       <w:pPr>
         <w:pBdr>
           <w:top w:color="000000" w:space="1" w:sz="4" w:val="single"/>
@@ -2114,7 +2129,7 @@
         </w:rPr>
       </w:r>
     </w:p>
-    <w:p>
+    <w:p ns1:paraId="0000005B">
       <w:pPr>
         <w:pBdr>
           <w:top w:color="000000" w:space="1" w:sz="4" w:val="single"/>
@@ -2130,7 +2145,7 @@
         </w:rPr>
       </w:r>
     </w:p>
-    <w:p>
+    <w:p ns1:paraId="0000005C">
       <w:pPr>
         <w:pBdr>
           <w:top w:color="000000" w:space="1" w:sz="4" w:val="single"/>
@@ -2146,7 +2161,7 @@
         </w:rPr>
       </w:r>
     </w:p>
-    <w:p>
+    <w:p ns1:paraId="0000005D">
       <w:pPr>
         <w:pBdr>
           <w:top w:color="000000" w:space="1" w:sz="4" w:val="single"/>
@@ -2162,7 +2177,7 @@
         </w:rPr>
       </w:r>
     </w:p>
-    <w:p>
+    <w:p ns1:paraId="0000005E">
       <w:pPr>
         <w:pBdr>
           <w:top w:color="000000" w:space="1" w:sz="4" w:val="single"/>
@@ -2177,7 +2192,7 @@
         <w:rPr>
           <w:rtl w:val="0"/>
         </w:rPr>
-        <w:t xml:space="preserve">Tp. Hồ Chí Minh, tháng MM/YYYY</w:t>
+        <w:t xml:space="preserve">Tp. Hồ Chí Minh, tháng 06/2026</w:t>
       </w:r>
     </w:p>
     <w:sectPr>

</xml_diff>